<commit_message>
Sync docx with HTML: этапы -> варианты structure
</commit_message>
<xml_diff>
--- a/docs/analysis/primer-podhoda-maskirovaniya-otchet-brokera.docx
+++ b/docs/analysis/primer-podhoda-maskirovaniya-otchet-brokera.docx
@@ -604,7 +604,164 @@
           <w:sz w:val="25"/>
           <w:szCs w:val="25"/>
         </w:rPr>
-        <w:t xml:space="preserve">2. Первый вариант — не подошёл</w:t>
+        <w:t xml:space="preserve">2. Вариант 1</w:t>
+      </w:r>
+    </w:p>
+    <w:tbl>
+      <w:tblPr>
+        <w:tblW w:type="dxa" w:w="9000"/>
+        <w:tblBorders>
+          <w:top w:val="single" w:color="auto" w:sz="4"/>
+          <w:left w:val="single" w:color="auto" w:sz="4"/>
+          <w:bottom w:val="single" w:color="auto" w:sz="4"/>
+          <w:right w:val="single" w:color="auto" w:sz="4"/>
+          <w:insideH w:val="single" w:color="auto" w:sz="4"/>
+          <w:insideV w:val="single" w:color="auto" w:sz="4"/>
+        </w:tblBorders>
+      </w:tblPr>
+      <w:tblGrid>
+        <w:gridCol w:w="3000"/>
+        <w:gridCol w:w="6000"/>
+      </w:tblGrid>
+      <w:tr>
+        <w:tc>
+          <w:tcPr>
+            <w:tcW w:type="dxa" w:w="3000"/>
+            <w:tcBorders>
+              <w:top w:val="single" w:color="999999" w:sz="4"/>
+              <w:left w:val="single" w:color="999999" w:sz="4"/>
+              <w:bottom w:val="single" w:color="999999" w:sz="4"/>
+              <w:right w:val="single" w:color="999999" w:sz="4"/>
+            </w:tcBorders>
+            <w:tcMar>
+              <w:top w:type="dxa" w:w="60"/>
+              <w:left w:type="dxa" w:w="100"/>
+              <w:bottom w:type="dxa" w:w="60"/>
+              <w:right w:type="dxa" w:w="100"/>
+            </w:tcMar>
+          </w:tcPr>
+          <w:p>
+            <w:r>
+              <w:rPr>
+                <w:rFonts w:ascii="Arial" w:cs="Arial" w:eastAsia="Arial" w:hAnsi="Arial"/>
+                <w:b/>
+                <w:bCs/>
+                <w:color w:val="1A1A1A"/>
+                <w:sz w:val="19"/>
+                <w:szCs w:val="19"/>
+              </w:rPr>
+              <w:t xml:space="preserve">Исходные данные</w:t>
+            </w:r>
+          </w:p>
+        </w:tc>
+        <w:tc>
+          <w:tcPr>
+            <w:tcW w:type="dxa" w:w="6000"/>
+            <w:tcBorders>
+              <w:top w:val="single" w:color="999999" w:sz="4"/>
+              <w:left w:val="single" w:color="999999" w:sz="4"/>
+              <w:bottom w:val="single" w:color="999999" w:sz="4"/>
+              <w:right w:val="single" w:color="999999" w:sz="4"/>
+            </w:tcBorders>
+            <w:tcMar>
+              <w:top w:type="dxa" w:w="60"/>
+              <w:left w:type="dxa" w:w="100"/>
+              <w:bottom w:type="dxa" w:w="60"/>
+              <w:right w:type="dxa" w:w="100"/>
+            </w:tcMar>
+          </w:tcPr>
+          <w:p>
+            <w:r>
+              <w:rPr>
+                <w:rFonts w:ascii="Arial" w:cs="Arial" w:eastAsia="Arial" w:hAnsi="Arial"/>
+                <w:b w:val="false"/>
+                <w:bCs w:val="false"/>
+                <w:color w:val="1A1A1A"/>
+                <w:sz w:val="19"/>
+                <w:szCs w:val="19"/>
+              </w:rPr>
+              <w:t xml:space="preserve">отчёт брокера — см. раздел 1</w:t>
+            </w:r>
+          </w:p>
+        </w:tc>
+      </w:tr>
+      <w:tr>
+        <w:tc>
+          <w:tcPr>
+            <w:tcW w:type="dxa" w:w="3000"/>
+            <w:tcBorders>
+              <w:top w:val="single" w:color="999999" w:sz="4"/>
+              <w:left w:val="single" w:color="999999" w:sz="4"/>
+              <w:bottom w:val="single" w:color="999999" w:sz="4"/>
+              <w:right w:val="single" w:color="999999" w:sz="4"/>
+            </w:tcBorders>
+            <w:tcMar>
+              <w:top w:type="dxa" w:w="60"/>
+              <w:left w:type="dxa" w:w="100"/>
+              <w:bottom w:type="dxa" w:w="60"/>
+              <w:right w:type="dxa" w:w="100"/>
+            </w:tcMar>
+          </w:tcPr>
+          <w:p>
+            <w:r>
+              <w:rPr>
+                <w:rFonts w:ascii="Arial" w:cs="Arial" w:eastAsia="Arial" w:hAnsi="Arial"/>
+                <w:b/>
+                <w:bCs/>
+                <w:color w:val="1A1A1A"/>
+                <w:sz w:val="19"/>
+                <w:szCs w:val="19"/>
+              </w:rPr>
+              <w:t xml:space="preserve">Маскируем</w:t>
+            </w:r>
+          </w:p>
+        </w:tc>
+        <w:tc>
+          <w:tcPr>
+            <w:tcW w:type="dxa" w:w="6000"/>
+            <w:tcBorders>
+              <w:top w:val="single" w:color="999999" w:sz="4"/>
+              <w:left w:val="single" w:color="999999" w:sz="4"/>
+              <w:bottom w:val="single" w:color="999999" w:sz="4"/>
+              <w:right w:val="single" w:color="999999" w:sz="4"/>
+            </w:tcBorders>
+            <w:tcMar>
+              <w:top w:type="dxa" w:w="60"/>
+              <w:left w:type="dxa" w:w="100"/>
+              <w:bottom w:type="dxa" w:w="60"/>
+              <w:right w:type="dxa" w:w="100"/>
+            </w:tcMar>
+          </w:tcPr>
+          <w:p>
+            <w:r>
+              <w:rPr>
+                <w:rFonts w:ascii="Arial" w:cs="Arial" w:eastAsia="Arial" w:hAnsi="Arial"/>
+                <w:b w:val="false"/>
+                <w:bCs w:val="false"/>
+                <w:color w:val="1A1A1A"/>
+                <w:sz w:val="19"/>
+                <w:szCs w:val="19"/>
+              </w:rPr>
+              <w:t xml:space="preserve">ФИО клиента, название компании</w:t>
+            </w:r>
+          </w:p>
+        </w:tc>
+      </w:tr>
+    </w:tbl>
+    <w:p>
+      <w:pPr>
+        <w:spacing w:after="140" w:line="300"/>
+      </w:pPr>
+      <w:r>
+        <w:rPr>
+          <w:rFonts w:ascii="Arial" w:cs="Arial" w:eastAsia="Arial" w:hAnsi="Arial"/>
+          <w:b/>
+          <w:bCs/>
+          <w:color w:val="1A1A1A"/>
+          <w:sz w:val="21"/>
+          <w:szCs w:val="21"/>
+        </w:rPr>
+        <w:t xml:space="preserve">Вывод:</w:t>
       </w:r>
     </w:p>
     <w:p>
@@ -618,35 +775,7 @@
           <w:sz w:val="21"/>
           <w:szCs w:val="21"/>
         </w:rPr>
-        <w:t xml:space="preserve">Первый рассмотренный вариант — скрывать только ФИО клиента и название компании, остальные данные оставлять без изменений. При проверке выяснилось, что этого недостаточно.</w:t>
-      </w:r>
-    </w:p>
-    <w:p>
-      <w:pPr>
-        <w:spacing w:after="140" w:line="300"/>
-      </w:pPr>
-      <w:r>
-        <w:rPr>
-          <w:rFonts w:ascii="Arial" w:cs="Arial" w:eastAsia="Arial" w:hAnsi="Arial"/>
-          <w:color w:val="1A1A1A"/>
-          <w:sz w:val="21"/>
-          <w:szCs w:val="21"/>
-        </w:rPr>
-        <w:t xml:space="preserve">Номер договора и точный состав портфеля сами по себе позволяют определить, о каком клиенте идёт речь, даже без имени: сочетание конкретных бумаг, их количества и остатка на конкретную дату — редкое и легко узнаваемое. Номер лицензии брокера, если он остаётся открытым, также позволяет установить компанию — он находится в открытом реестре Банка России — независимо от того, скрыто название компании в тексте или нет.</w:t>
-      </w:r>
-    </w:p>
-    <w:p>
-      <w:pPr>
-        <w:spacing w:after="140" w:line="300"/>
-      </w:pPr>
-      <w:r>
-        <w:rPr>
-          <w:rFonts w:ascii="Arial" w:cs="Arial" w:eastAsia="Arial" w:hAnsi="Arial"/>
-          <w:color w:val="1A1A1A"/>
-          <w:sz w:val="21"/>
-          <w:szCs w:val="21"/>
-        </w:rPr>
-        <w:t xml:space="preserve">Поэтому список того, что нужно скрывать, был расширен.</w:t>
+        <w:t xml:space="preserve">Не защищает данные. Номер договора и точный состав портфеля сами по себе позволяют определить, о каком клиенте идёт речь, даже без имени: сочетание конкретных бумаг, их количества и остатка на конкретную дату — редкое и легко узнаваемое. Номер лицензии брокера, если он остаётся открытым, также позволяет установить компанию — он находится в открытом реестре Банка России — независимо от того, скрыто название компании в тексте или нет.</w:t>
       </w:r>
     </w:p>
     <w:p>
@@ -663,7 +792,162 @@
           <w:sz w:val="25"/>
           <w:szCs w:val="25"/>
         </w:rPr>
-        <w:t xml:space="preserve">3. Рабочая схема</w:t>
+        <w:t xml:space="preserve">3. Вариант 2</w:t>
+      </w:r>
+    </w:p>
+    <w:tbl>
+      <w:tblPr>
+        <w:tblW w:type="dxa" w:w="9000"/>
+        <w:tblBorders>
+          <w:top w:val="single" w:color="auto" w:sz="4"/>
+          <w:left w:val="single" w:color="auto" w:sz="4"/>
+          <w:bottom w:val="single" w:color="auto" w:sz="4"/>
+          <w:right w:val="single" w:color="auto" w:sz="4"/>
+          <w:insideH w:val="single" w:color="auto" w:sz="4"/>
+          <w:insideV w:val="single" w:color="auto" w:sz="4"/>
+        </w:tblBorders>
+      </w:tblPr>
+      <w:tblGrid>
+        <w:gridCol w:w="3000"/>
+        <w:gridCol w:w="6000"/>
+      </w:tblGrid>
+      <w:tr>
+        <w:tc>
+          <w:tcPr>
+            <w:tcW w:type="dxa" w:w="3000"/>
+            <w:tcBorders>
+              <w:top w:val="single" w:color="999999" w:sz="4"/>
+              <w:left w:val="single" w:color="999999" w:sz="4"/>
+              <w:bottom w:val="single" w:color="999999" w:sz="4"/>
+              <w:right w:val="single" w:color="999999" w:sz="4"/>
+            </w:tcBorders>
+            <w:tcMar>
+              <w:top w:type="dxa" w:w="60"/>
+              <w:left w:type="dxa" w:w="100"/>
+              <w:bottom w:type="dxa" w:w="60"/>
+              <w:right w:type="dxa" w:w="100"/>
+            </w:tcMar>
+          </w:tcPr>
+          <w:p>
+            <w:r>
+              <w:rPr>
+                <w:rFonts w:ascii="Arial" w:cs="Arial" w:eastAsia="Arial" w:hAnsi="Arial"/>
+                <w:b/>
+                <w:bCs/>
+                <w:color w:val="1A1A1A"/>
+                <w:sz w:val="19"/>
+                <w:szCs w:val="19"/>
+              </w:rPr>
+              <w:t xml:space="preserve">Исходные данные</w:t>
+            </w:r>
+          </w:p>
+        </w:tc>
+        <w:tc>
+          <w:tcPr>
+            <w:tcW w:type="dxa" w:w="6000"/>
+            <w:tcBorders>
+              <w:top w:val="single" w:color="999999" w:sz="4"/>
+              <w:left w:val="single" w:color="999999" w:sz="4"/>
+              <w:bottom w:val="single" w:color="999999" w:sz="4"/>
+              <w:right w:val="single" w:color="999999" w:sz="4"/>
+            </w:tcBorders>
+            <w:tcMar>
+              <w:top w:type="dxa" w:w="60"/>
+              <w:left w:type="dxa" w:w="100"/>
+              <w:bottom w:type="dxa" w:w="60"/>
+              <w:right w:type="dxa" w:w="100"/>
+            </w:tcMar>
+          </w:tcPr>
+          <w:p>
+            <w:r>
+              <w:rPr>
+                <w:rFonts w:ascii="Arial" w:cs="Arial" w:eastAsia="Arial" w:hAnsi="Arial"/>
+                <w:b w:val="false"/>
+                <w:bCs w:val="false"/>
+                <w:color w:val="1A1A1A"/>
+                <w:sz w:val="19"/>
+                <w:szCs w:val="19"/>
+              </w:rPr>
+              <w:t xml:space="preserve">тот же отчёт брокера</w:t>
+            </w:r>
+          </w:p>
+        </w:tc>
+      </w:tr>
+      <w:tr>
+        <w:tc>
+          <w:tcPr>
+            <w:tcW w:type="dxa" w:w="3000"/>
+            <w:tcBorders>
+              <w:top w:val="single" w:color="999999" w:sz="4"/>
+              <w:left w:val="single" w:color="999999" w:sz="4"/>
+              <w:bottom w:val="single" w:color="999999" w:sz="4"/>
+              <w:right w:val="single" w:color="999999" w:sz="4"/>
+            </w:tcBorders>
+            <w:tcMar>
+              <w:top w:type="dxa" w:w="60"/>
+              <w:left w:type="dxa" w:w="100"/>
+              <w:bottom w:type="dxa" w:w="60"/>
+              <w:right w:type="dxa" w:w="100"/>
+            </w:tcMar>
+          </w:tcPr>
+          <w:p>
+            <w:r>
+              <w:rPr>
+                <w:rFonts w:ascii="Arial" w:cs="Arial" w:eastAsia="Arial" w:hAnsi="Arial"/>
+                <w:b/>
+                <w:bCs/>
+                <w:color w:val="1A1A1A"/>
+                <w:sz w:val="19"/>
+                <w:szCs w:val="19"/>
+              </w:rPr>
+              <w:t xml:space="preserve">Маскируем</w:t>
+            </w:r>
+          </w:p>
+        </w:tc>
+        <w:tc>
+          <w:tcPr>
+            <w:tcW w:type="dxa" w:w="6000"/>
+            <w:tcBorders>
+              <w:top w:val="single" w:color="999999" w:sz="4"/>
+              <w:left w:val="single" w:color="999999" w:sz="4"/>
+              <w:bottom w:val="single" w:color="999999" w:sz="4"/>
+              <w:right w:val="single" w:color="999999" w:sz="4"/>
+            </w:tcBorders>
+            <w:tcMar>
+              <w:top w:type="dxa" w:w="60"/>
+              <w:left w:type="dxa" w:w="100"/>
+              <w:bottom w:type="dxa" w:w="60"/>
+              <w:right w:type="dxa" w:w="100"/>
+            </w:tcMar>
+          </w:tcPr>
+          <w:p>
+            <w:r>
+              <w:rPr>
+                <w:rFonts w:ascii="Arial" w:cs="Arial" w:eastAsia="Arial" w:hAnsi="Arial"/>
+                <w:b w:val="false"/>
+                <w:bCs w:val="false"/>
+                <w:color w:val="1A1A1A"/>
+                <w:sz w:val="19"/>
+                <w:szCs w:val="19"/>
+              </w:rPr>
+              <w:t xml:space="preserve">ФИО клиента и сотрудников, номер договора/счетов, название/лицензию/адрес брокера</w:t>
+            </w:r>
+          </w:p>
+        </w:tc>
+      </w:tr>
+    </w:tbl>
+    <w:p>
+      <w:pPr>
+        <w:spacing w:after="140" w:line="300"/>
+      </w:pPr>
+      <w:r>
+        <w:rPr>
+          <w:rFonts w:ascii="Arial" w:cs="Arial" w:eastAsia="Arial" w:hAnsi="Arial"/>
+          <w:color w:val="1A1A1A"/>
+          <w:sz w:val="21"/>
+          <w:szCs w:val="21"/>
+        </w:rPr>
+        <w:t xml:space="preserve">Что происходит с каждым полем:</w:t>
       </w:r>
     </w:p>
     <w:tbl>
@@ -1117,6 +1401,36 @@
         </w:tc>
       </w:tr>
     </w:tbl>
+    <w:p>
+      <w:pPr>
+        <w:spacing w:after="140" w:line="300"/>
+      </w:pPr>
+      <w:r>
+        <w:rPr>
+          <w:rFonts w:ascii="Arial" w:cs="Arial" w:eastAsia="Arial" w:hAnsi="Arial"/>
+          <w:b/>
+          <w:bCs/>
+          <w:color w:val="1A1A1A"/>
+          <w:sz w:val="21"/>
+          <w:szCs w:val="21"/>
+        </w:rPr>
+        <w:t xml:space="preserve">Вывод:</w:t>
+      </w:r>
+    </w:p>
+    <w:p>
+      <w:pPr>
+        <w:spacing w:after="140" w:line="300"/>
+      </w:pPr>
+      <w:r>
+        <w:rPr>
+          <w:rFonts w:ascii="Arial" w:cs="Arial" w:eastAsia="Arial" w:hAnsi="Arial"/>
+          <w:color w:val="1A1A1A"/>
+          <w:sz w:val="21"/>
+          <w:szCs w:val="21"/>
+        </w:rPr>
+        <w:t xml:space="preserve">Защищено 7 из 8 полей, аналитическая ценность сохранена — баланс и состав портфеля остаются в исходном виде для анализа.</w:t>
+      </w:r>
+    </w:p>
     <w:p>
       <w:pPr>
         <w:pStyle w:val="Heading1"/>

</xml_diff>

<commit_message>
Expand Вариант 2 with a per-field detection description
Adds "Как определяется каждое поле" — a plain-language mapping of
each masked field to how it's actually detected, drawn from the
engineering breakdown in "Три слоя маскирования" (docs/analysis/
pokrytie-maskirovaniya-perechen-d8.xlsx) but without regex/algorithm
detail: key-word + context for names, format pattern for account/
contract/license numbers, a dedicated lookup for the company's own
name (as opposed to a generic "any organization" rule, which would
also catch security names in the portfolio). Applied to both the
HTML and docx versions identically.
</commit_message>
<xml_diff>
--- a/docs/analysis/primer-podhoda-maskirovaniya-otchet-brokera.docx
+++ b/docs/analysis/primer-podhoda-maskirovaniya-otchet-brokera.docx
@@ -1396,6 +1396,347 @@
                 <w:szCs w:val="19"/>
               </w:rPr>
               <w:t xml:space="preserve">Не скрывается — общедоступный биржевой код, к клиенту или компании не привязан</w:t>
+            </w:r>
+          </w:p>
+        </w:tc>
+      </w:tr>
+    </w:tbl>
+    <w:p>
+      <w:pPr>
+        <w:spacing w:after="140" w:line="300"/>
+      </w:pPr>
+      <w:r>
+        <w:rPr>
+          <w:rFonts w:ascii="Arial" w:cs="Arial" w:eastAsia="Arial" w:hAnsi="Arial"/>
+          <w:color w:val="1A1A1A"/>
+          <w:sz w:val="21"/>
+          <w:szCs w:val="21"/>
+        </w:rPr>
+        <w:t xml:space="preserve">Как определяется каждое поле:</w:t>
+      </w:r>
+    </w:p>
+    <w:tbl>
+      <w:tblPr>
+        <w:tblW w:type="dxa" w:w="9000"/>
+        <w:tblBorders>
+          <w:top w:val="single" w:color="auto" w:sz="4"/>
+          <w:left w:val="single" w:color="auto" w:sz="4"/>
+          <w:bottom w:val="single" w:color="auto" w:sz="4"/>
+          <w:right w:val="single" w:color="auto" w:sz="4"/>
+          <w:insideH w:val="single" w:color="auto" w:sz="4"/>
+          <w:insideV w:val="single" w:color="auto" w:sz="4"/>
+        </w:tblBorders>
+      </w:tblPr>
+      <w:tblGrid>
+        <w:gridCol w:w="3400"/>
+        <w:gridCol w:w="5600"/>
+      </w:tblGrid>
+      <w:tr>
+        <w:tc>
+          <w:tcPr>
+            <w:tcW w:type="dxa" w:w="3400"/>
+            <w:tcBorders>
+              <w:top w:val="single" w:color="999999" w:sz="4"/>
+              <w:left w:val="single" w:color="999999" w:sz="4"/>
+              <w:bottom w:val="single" w:color="999999" w:sz="4"/>
+              <w:right w:val="single" w:color="999999" w:sz="4"/>
+            </w:tcBorders>
+            <w:tcMar>
+              <w:top w:type="dxa" w:w="70"/>
+              <w:left w:type="dxa" w:w="100"/>
+              <w:bottom w:type="dxa" w:w="70"/>
+              <w:right w:type="dxa" w:w="100"/>
+            </w:tcMar>
+          </w:tcPr>
+          <w:p>
+            <w:r>
+              <w:rPr>
+                <w:rFonts w:ascii="Arial" w:cs="Arial" w:eastAsia="Arial" w:hAnsi="Arial"/>
+                <w:b/>
+                <w:bCs/>
+                <w:color w:val="14181F"/>
+                <w:sz w:val="19"/>
+                <w:szCs w:val="19"/>
+              </w:rPr>
+              <w:t xml:space="preserve">Поле</w:t>
+            </w:r>
+          </w:p>
+        </w:tc>
+        <w:tc>
+          <w:tcPr>
+            <w:tcW w:type="dxa" w:w="5600"/>
+            <w:tcBorders>
+              <w:top w:val="single" w:color="999999" w:sz="4"/>
+              <w:left w:val="single" w:color="999999" w:sz="4"/>
+              <w:bottom w:val="single" w:color="999999" w:sz="4"/>
+              <w:right w:val="single" w:color="999999" w:sz="4"/>
+            </w:tcBorders>
+            <w:tcMar>
+              <w:top w:type="dxa" w:w="70"/>
+              <w:left w:type="dxa" w:w="100"/>
+              <w:bottom w:type="dxa" w:w="70"/>
+              <w:right w:type="dxa" w:w="100"/>
+            </w:tcMar>
+          </w:tcPr>
+          <w:p>
+            <w:r>
+              <w:rPr>
+                <w:rFonts w:ascii="Arial" w:cs="Arial" w:eastAsia="Arial" w:hAnsi="Arial"/>
+                <w:b/>
+                <w:bCs/>
+                <w:color w:val="14181F"/>
+                <w:sz w:val="19"/>
+                <w:szCs w:val="19"/>
+              </w:rPr>
+              <w:t xml:space="preserve">Как определяется</w:t>
+            </w:r>
+          </w:p>
+        </w:tc>
+      </w:tr>
+      <w:tr>
+        <w:tc>
+          <w:tcPr>
+            <w:tcW w:type="dxa" w:w="3400"/>
+            <w:tcBorders>
+              <w:top w:val="single" w:color="999999" w:sz="4"/>
+              <w:left w:val="single" w:color="999999" w:sz="4"/>
+              <w:bottom w:val="single" w:color="999999" w:sz="4"/>
+              <w:right w:val="single" w:color="999999" w:sz="4"/>
+            </w:tcBorders>
+            <w:tcMar>
+              <w:top w:type="dxa" w:w="60"/>
+              <w:left w:type="dxa" w:w="100"/>
+              <w:bottom w:type="dxa" w:w="60"/>
+              <w:right w:type="dxa" w:w="100"/>
+            </w:tcMar>
+          </w:tcPr>
+          <w:p>
+            <w:r>
+              <w:rPr>
+                <w:rFonts w:ascii="Arial" w:cs="Arial" w:eastAsia="Arial" w:hAnsi="Arial"/>
+                <w:b/>
+                <w:bCs/>
+                <w:color w:val="1A1A1A"/>
+                <w:sz w:val="19"/>
+                <w:szCs w:val="19"/>
+              </w:rPr>
+              <w:t xml:space="preserve">ФИО клиента и сотрудников</w:t>
+            </w:r>
+          </w:p>
+        </w:tc>
+        <w:tc>
+          <w:tcPr>
+            <w:tcW w:type="dxa" w:w="5600"/>
+            <w:tcBorders>
+              <w:top w:val="single" w:color="999999" w:sz="4"/>
+              <w:left w:val="single" w:color="999999" w:sz="4"/>
+              <w:bottom w:val="single" w:color="999999" w:sz="4"/>
+              <w:right w:val="single" w:color="999999" w:sz="4"/>
+            </w:tcBorders>
+            <w:tcMar>
+              <w:top w:type="dxa" w:w="60"/>
+              <w:left w:type="dxa" w:w="100"/>
+              <w:bottom w:type="dxa" w:w="60"/>
+              <w:right w:type="dxa" w:w="100"/>
+            </w:tcMar>
+          </w:tcPr>
+          <w:p>
+            <w:r>
+              <w:rPr>
+                <w:rFonts w:ascii="Arial" w:cs="Arial" w:eastAsia="Arial" w:hAnsi="Arial"/>
+                <w:b w:val="false"/>
+                <w:bCs w:val="false"/>
+                <w:color w:val="1A1A1A"/>
+                <w:sz w:val="19"/>
+                <w:szCs w:val="19"/>
+              </w:rPr>
+              <w:t xml:space="preserve">По ключевым словам рядом с именем («Клиент:», подпись в конце документа) и по общему контексту фразы — так же, как в тексте распознаётся любое упоминание имени человека</w:t>
+            </w:r>
+          </w:p>
+        </w:tc>
+      </w:tr>
+      <w:tr>
+        <w:tc>
+          <w:tcPr>
+            <w:tcW w:type="dxa" w:w="3400"/>
+            <w:tcBorders>
+              <w:top w:val="single" w:color="999999" w:sz="4"/>
+              <w:left w:val="single" w:color="999999" w:sz="4"/>
+              <w:bottom w:val="single" w:color="999999" w:sz="4"/>
+              <w:right w:val="single" w:color="999999" w:sz="4"/>
+            </w:tcBorders>
+            <w:tcMar>
+              <w:top w:type="dxa" w:w="60"/>
+              <w:left w:type="dxa" w:w="100"/>
+              <w:bottom w:type="dxa" w:w="60"/>
+              <w:right w:type="dxa" w:w="100"/>
+            </w:tcMar>
+          </w:tcPr>
+          <w:p>
+            <w:r>
+              <w:rPr>
+                <w:rFonts w:ascii="Arial" w:cs="Arial" w:eastAsia="Arial" w:hAnsi="Arial"/>
+                <w:b/>
+                <w:bCs/>
+                <w:color w:val="1A1A1A"/>
+                <w:sz w:val="19"/>
+                <w:szCs w:val="19"/>
+              </w:rPr>
+              <w:t xml:space="preserve">Номер договора, брокерский и лицевой счёт</w:t>
+            </w:r>
+          </w:p>
+        </w:tc>
+        <w:tc>
+          <w:tcPr>
+            <w:tcW w:type="dxa" w:w="5600"/>
+            <w:tcBorders>
+              <w:top w:val="single" w:color="999999" w:sz="4"/>
+              <w:left w:val="single" w:color="999999" w:sz="4"/>
+              <w:bottom w:val="single" w:color="999999" w:sz="4"/>
+              <w:right w:val="single" w:color="999999" w:sz="4"/>
+            </w:tcBorders>
+            <w:tcMar>
+              <w:top w:type="dxa" w:w="60"/>
+              <w:left w:type="dxa" w:w="100"/>
+              <w:bottom w:type="dxa" w:w="60"/>
+              <w:right w:type="dxa" w:w="100"/>
+            </w:tcMar>
+          </w:tcPr>
+          <w:p>
+            <w:r>
+              <w:rPr>
+                <w:rFonts w:ascii="Arial" w:cs="Arial" w:eastAsia="Arial" w:hAnsi="Arial"/>
+                <w:b w:val="false"/>
+                <w:bCs w:val="false"/>
+                <w:color w:val="1A1A1A"/>
+                <w:sz w:val="19"/>
+                <w:szCs w:val="19"/>
+              </w:rPr>
+              <w:t xml:space="preserve">По формату записи — сочетанию букв и цифр, характерному для номеров счетов и договоров Общества</w:t>
+            </w:r>
+          </w:p>
+        </w:tc>
+      </w:tr>
+      <w:tr>
+        <w:tc>
+          <w:tcPr>
+            <w:tcW w:type="dxa" w:w="3400"/>
+            <w:tcBorders>
+              <w:top w:val="single" w:color="999999" w:sz="4"/>
+              <w:left w:val="single" w:color="999999" w:sz="4"/>
+              <w:bottom w:val="single" w:color="999999" w:sz="4"/>
+              <w:right w:val="single" w:color="999999" w:sz="4"/>
+            </w:tcBorders>
+            <w:tcMar>
+              <w:top w:type="dxa" w:w="60"/>
+              <w:left w:type="dxa" w:w="100"/>
+              <w:bottom w:type="dxa" w:w="60"/>
+              <w:right w:type="dxa" w:w="100"/>
+            </w:tcMar>
+          </w:tcPr>
+          <w:p>
+            <w:r>
+              <w:rPr>
+                <w:rFonts w:ascii="Arial" w:cs="Arial" w:eastAsia="Arial" w:hAnsi="Arial"/>
+                <w:b/>
+                <w:bCs/>
+                <w:color w:val="1A1A1A"/>
+                <w:sz w:val="19"/>
+                <w:szCs w:val="19"/>
+              </w:rPr>
+              <w:t xml:space="preserve">Название компании</w:t>
+            </w:r>
+          </w:p>
+        </w:tc>
+        <w:tc>
+          <w:tcPr>
+            <w:tcW w:type="dxa" w:w="5600"/>
+            <w:tcBorders>
+              <w:top w:val="single" w:color="999999" w:sz="4"/>
+              <w:left w:val="single" w:color="999999" w:sz="4"/>
+              <w:bottom w:val="single" w:color="999999" w:sz="4"/>
+              <w:right w:val="single" w:color="999999" w:sz="4"/>
+            </w:tcBorders>
+            <w:tcMar>
+              <w:top w:type="dxa" w:w="60"/>
+              <w:left w:type="dxa" w:w="100"/>
+              <w:bottom w:type="dxa" w:w="60"/>
+              <w:right w:type="dxa" w:w="100"/>
+            </w:tcMar>
+          </w:tcPr>
+          <w:p>
+            <w:r>
+              <w:rPr>
+                <w:rFonts w:ascii="Arial" w:cs="Arial" w:eastAsia="Arial" w:hAnsi="Arial"/>
+                <w:b w:val="false"/>
+                <w:bCs w:val="false"/>
+                <w:color w:val="1A1A1A"/>
+                <w:sz w:val="19"/>
+                <w:szCs w:val="19"/>
+              </w:rPr>
+              <w:t xml:space="preserve">Отдельно от других названий в документе (например, от названий ценных бумаг) — по справочнику собственного юридического лица заказчика, а не по общему правилу «любая организация»</w:t>
+            </w:r>
+          </w:p>
+        </w:tc>
+      </w:tr>
+      <w:tr>
+        <w:tc>
+          <w:tcPr>
+            <w:tcW w:type="dxa" w:w="3400"/>
+            <w:tcBorders>
+              <w:top w:val="single" w:color="999999" w:sz="4"/>
+              <w:left w:val="single" w:color="999999" w:sz="4"/>
+              <w:bottom w:val="single" w:color="999999" w:sz="4"/>
+              <w:right w:val="single" w:color="999999" w:sz="4"/>
+            </w:tcBorders>
+            <w:tcMar>
+              <w:top w:type="dxa" w:w="60"/>
+              <w:left w:type="dxa" w:w="100"/>
+              <w:bottom w:type="dxa" w:w="60"/>
+              <w:right w:type="dxa" w:w="100"/>
+            </w:tcMar>
+          </w:tcPr>
+          <w:p>
+            <w:r>
+              <w:rPr>
+                <w:rFonts w:ascii="Arial" w:cs="Arial" w:eastAsia="Arial" w:hAnsi="Arial"/>
+                <w:b/>
+                <w:bCs/>
+                <w:color w:val="1A1A1A"/>
+                <w:sz w:val="19"/>
+                <w:szCs w:val="19"/>
+              </w:rPr>
+              <w:t xml:space="preserve">Номер лицензии и адрес брокера</w:t>
+            </w:r>
+          </w:p>
+        </w:tc>
+        <w:tc>
+          <w:tcPr>
+            <w:tcW w:type="dxa" w:w="5600"/>
+            <w:tcBorders>
+              <w:top w:val="single" w:color="999999" w:sz="4"/>
+              <w:left w:val="single" w:color="999999" w:sz="4"/>
+              <w:bottom w:val="single" w:color="999999" w:sz="4"/>
+              <w:right w:val="single" w:color="999999" w:sz="4"/>
+            </w:tcBorders>
+            <w:tcMar>
+              <w:top w:type="dxa" w:w="60"/>
+              <w:left w:type="dxa" w:w="100"/>
+              <w:bottom w:type="dxa" w:w="60"/>
+              <w:right w:type="dxa" w:w="100"/>
+            </w:tcMar>
+          </w:tcPr>
+          <w:p>
+            <w:r>
+              <w:rPr>
+                <w:rFonts w:ascii="Arial" w:cs="Arial" w:eastAsia="Arial" w:hAnsi="Arial"/>
+                <w:b w:val="false"/>
+                <w:bCs w:val="false"/>
+                <w:color w:val="1A1A1A"/>
+                <w:sz w:val="19"/>
+                <w:szCs w:val="19"/>
+              </w:rPr>
+              <w:t xml:space="preserve">По формату записи, тем же способом, что и номер договора</w:t>
             </w:r>
           </w:p>
         </w:tc>

</xml_diff>

<commit_message>
Remove residual-risk and next-steps blocks from broker-statement example
</commit_message>
<xml_diff>
--- a/docs/analysis/primer-podhoda-maskirovaniya-otchet-brokera.docx
+++ b/docs/analysis/primer-podhoda-maskirovaniya-otchet-brokera.docx
@@ -2006,111 +2006,6 @@
         </w:tc>
       </w:tr>
     </w:tbl>
-    <w:p>
-      <w:pPr>
-        <w:pStyle w:val="Heading1"/>
-        <w:spacing w:after="120" w:before="300"/>
-      </w:pPr>
-      <w:r>
-        <w:rPr>
-          <w:rFonts w:ascii="Arial" w:cs="Arial" w:eastAsia="Arial" w:hAnsi="Arial"/>
-          <w:b/>
-          <w:bCs/>
-          <w:color w:val="14181F"/>
-          <w:sz w:val="25"/>
-          <w:szCs w:val="25"/>
-        </w:rPr>
-        <w:t xml:space="preserve">5. Что остаётся риском</w:t>
-      </w:r>
-    </w:p>
-    <w:p>
-      <w:pPr>
-        <w:spacing w:after="140" w:line="300"/>
-      </w:pPr>
-      <w:r>
-        <w:rPr>
-          <w:rFonts w:ascii="Arial" w:cs="Arial" w:eastAsia="Arial" w:hAnsi="Arial"/>
-          <w:color w:val="1A1A1A"/>
-          <w:sz w:val="21"/>
-          <w:szCs w:val="21"/>
-        </w:rPr>
-        <w:t xml:space="preserve">Полностью исключить риск маскированием одних только текстовых полей невозможно. Точный состав портфеля на конкретную дату — сам по себе редкое, узнаваемое сочетание данных: при пересечении с другой утечкой (не обязательно из этой системы) документ теоретически можно сопоставить с конкретным клиентом даже без прямых идентификаторов. По этой причине для документов с портфелем и счетами по умолчанию рекомендуется внутренний канал, а не внешний.</w:t>
-      </w:r>
-    </w:p>
-    <w:p>
-      <w:pPr>
-        <w:pStyle w:val="Heading1"/>
-        <w:spacing w:after="120" w:before="300"/>
-      </w:pPr>
-      <w:r>
-        <w:rPr>
-          <w:rFonts w:ascii="Arial" w:cs="Arial" w:eastAsia="Arial" w:hAnsi="Arial"/>
-          <w:b/>
-          <w:bCs/>
-          <w:color w:val="14181F"/>
-          <w:sz w:val="25"/>
-          <w:szCs w:val="25"/>
-        </w:rPr>
-        <w:t xml:space="preserve">6. Дальнейшие шаги</w:t>
-      </w:r>
-    </w:p>
-    <w:p>
-      <w:pPr>
-        <w:pStyle w:val="ListParagraph"/>
-        <w:numPr>
-          <w:ilvl w:val="0"/>
-          <w:numId w:val="2"/>
-        </w:numPr>
-        <w:spacing w:after="90" w:line="280"/>
-      </w:pPr>
-      <w:r>
-        <w:rPr>
-          <w:rFonts w:ascii="Arial" w:cs="Arial" w:eastAsia="Arial" w:hAnsi="Arial"/>
-          <w:color w:val="1A1A1A"/>
-          <w:sz w:val="21"/>
-          <w:szCs w:val="21"/>
-        </w:rPr>
-        <w:t xml:space="preserve">Согласовать, в каких случаях документ передаётся во внешний сервис, а в каких — используется только внутри.</w:t>
-      </w:r>
-    </w:p>
-    <w:p>
-      <w:pPr>
-        <w:pStyle w:val="ListParagraph"/>
-        <w:numPr>
-          <w:ilvl w:val="0"/>
-          <w:numId w:val="2"/>
-        </w:numPr>
-        <w:spacing w:after="90" w:line="280"/>
-      </w:pPr>
-      <w:r>
-        <w:rPr>
-          <w:rFonts w:ascii="Arial" w:cs="Arial" w:eastAsia="Arial" w:hAnsi="Arial"/>
-          <w:color w:val="1A1A1A"/>
-          <w:sz w:val="21"/>
-          <w:szCs w:val="21"/>
-        </w:rPr>
-        <w:t xml:space="preserve">Согласовать с разработчиком платформы техническую реализацию новых типов данных — номер договора, номер лицензии.</w:t>
-      </w:r>
-    </w:p>
-    <w:p>
-      <w:pPr>
-        <w:pStyle w:val="ListParagraph"/>
-        <w:numPr>
-          <w:ilvl w:val="0"/>
-          <w:numId w:val="2"/>
-        </w:numPr>
-        <w:spacing w:after="90" w:line="280"/>
-      </w:pPr>
-      <w:r>
-        <w:rPr>
-          <w:rFonts w:ascii="Arial" w:cs="Arial" w:eastAsia="Arial" w:hAnsi="Arial"/>
-          <w:color w:val="1A1A1A"/>
-          <w:sz w:val="21"/>
-          <w:szCs w:val="21"/>
-        </w:rPr>
-        <w:t xml:space="preserve">Проверить результат на реальном документе в рамках пилота.</w:t>
-      </w:r>
-    </w:p>
     <w:sectPr>
       <w:pgSz w:w="11906" w:h="16838" w:orient="portrait"/>
       <w:pgMar w:top="1440" w:right="1440" w:bottom="1440" w:left="1440" w:header="708" w:footer="708" w:gutter="0"/>
@@ -2299,12 +2194,6 @@
   </w:abstractNum>
   <w:num w:numId="1">
     <w:abstractNumId w:val="1"/>
-    <w:lvlOverride w:ilvl="0">
-      <w:startOverride w:val="1"/>
-    </w:lvlOverride>
-  </w:num>
-  <w:num w:numId="2">
-    <w:abstractNumId w:val="2"/>
     <w:lvlOverride w:ilvl="0">
       <w:startOverride w:val="1"/>
     </w:lvlOverride>

</xml_diff>